<commit_message>
docs: regenerate runbook .docx and .pdf with working TOC
Output from the updated generator: the TOC now renders directly
in both Word and PDF, and the customer-facing body text has the
em dashes replaced with natural punctuation.
</commit_message>
<xml_diff>
--- a/docs/CloudLens_Ansible_Azure_Customer_Runbook.docx
+++ b/docs/CloudLens_Ansible_Azure_Customer_Runbook.docx
@@ -214,22 +214,311 @@
       </w:r>
     </w:p>
     <w:p>
+      <w:pPr>
+        <w:spacing w:after="120"/>
+      </w:pPr>
+    </w:p>
+    <w:p>
+      <w:pPr>
+        <w:tabs>
+          <w:tab w:pos="9072" w:val="right" w:leader="dot"/>
+        </w:tabs>
+        <w:spacing w:after="40" w:before="0"/>
+      </w:pPr>
       <w:r>
         <w:rPr>
-          <w:i/>
-          <w:color w:val="556575"/>
-          <w:sz w:val="19"/>
+          <w:rFonts w:ascii="Calibri" w:hAnsi="Calibri"/>
+          <w:b/>
+          <w:color w:val="005A9E"/>
+          <w:sz w:val="24"/>
         </w:rPr>
-        <w:t>In Microsoft Word: right-click the entry below and choose 'Update Field' to populate the full table of contents.</w:t>
+        <w:t>1. Executive Summary</w:t>
+      </w:r>
+      <w:r>
+        <w:tab/>
       </w:r>
     </w:p>
     <w:p>
+      <w:pPr>
+        <w:tabs>
+          <w:tab w:pos="9072" w:val="right" w:leader="dot"/>
+        </w:tabs>
+        <w:spacing w:after="40" w:before="0"/>
+      </w:pPr>
       <w:r>
-        <w:fldChar w:fldCharType="begin"/>
-        <w:instrText xml:space="preserve">TOC \o "1-3" \h \z \u</w:instrText>
-        <w:fldChar w:fldCharType="separate"/>
-        <w:t>Right-click and choose 'Update Field' to refresh the table of contents.</w:t>
-        <w:fldChar w:fldCharType="end"/>
+        <w:rPr>
+          <w:rFonts w:ascii="Calibri" w:hAnsi="Calibri"/>
+          <w:b/>
+          <w:color w:val="005A9E"/>
+          <w:sz w:val="24"/>
+        </w:rPr>
+        <w:t>2. Solution Overview</w:t>
+      </w:r>
+      <w:r>
+        <w:tab/>
+      </w:r>
+    </w:p>
+    <w:p>
+      <w:pPr>
+        <w:tabs>
+          <w:tab w:pos="9072" w:val="right" w:leader="dot"/>
+        </w:tabs>
+        <w:spacing w:after="40" w:before="0"/>
+      </w:pPr>
+      <w:r>
+        <w:rPr>
+          <w:rFonts w:ascii="Calibri" w:hAnsi="Calibri"/>
+          <w:b/>
+          <w:color w:val="005A9E"/>
+          <w:sz w:val="24"/>
+        </w:rPr>
+        <w:t>3. Choosing Your Deployment Path</w:t>
+      </w:r>
+      <w:r>
+        <w:tab/>
+      </w:r>
+    </w:p>
+    <w:p>
+      <w:pPr>
+        <w:tabs>
+          <w:tab w:pos="9072" w:val="right" w:leader="dot"/>
+        </w:tabs>
+        <w:spacing w:after="40" w:before="0"/>
+      </w:pPr>
+      <w:r>
+        <w:rPr>
+          <w:rFonts w:ascii="Calibri" w:hAnsi="Calibri"/>
+          <w:b/>
+          <w:color w:val="005A9E"/>
+          <w:sz w:val="24"/>
+        </w:rPr>
+        <w:t>4. Prerequisites Checklist</w:t>
+      </w:r>
+      <w:r>
+        <w:tab/>
+      </w:r>
+    </w:p>
+    <w:p>
+      <w:pPr>
+        <w:tabs>
+          <w:tab w:pos="9072" w:val="right" w:leader="dot"/>
+        </w:tabs>
+        <w:spacing w:after="40" w:before="0"/>
+      </w:pPr>
+      <w:r>
+        <w:rPr>
+          <w:rFonts w:ascii="Calibri" w:hAnsi="Calibri"/>
+          <w:b/>
+          <w:color w:val="005A9E"/>
+          <w:sz w:val="24"/>
+        </w:rPr>
+        <w:t>5. Deployment, Step by Step</w:t>
+      </w:r>
+      <w:r>
+        <w:tab/>
+      </w:r>
+    </w:p>
+    <w:p>
+      <w:pPr>
+        <w:tabs>
+          <w:tab w:pos="9072" w:val="right" w:leader="dot"/>
+        </w:tabs>
+        <w:spacing w:after="40" w:before="0"/>
+        <w:ind w:left="504"/>
+      </w:pPr>
+      <w:r>
+        <w:rPr>
+          <w:rFonts w:ascii="Calibri" w:hAnsi="Calibri"/>
+          <w:b w:val="0"/>
+          <w:color w:val="1B2A4A"/>
+          <w:sz w:val="21"/>
+        </w:rPr>
+        <w:t>5.1  Tier 1: One-Click from the Azure Portal</w:t>
+      </w:r>
+      <w:r>
+        <w:tab/>
+      </w:r>
+    </w:p>
+    <w:p>
+      <w:pPr>
+        <w:tabs>
+          <w:tab w:pos="9072" w:val="right" w:leader="dot"/>
+        </w:tabs>
+        <w:spacing w:after="40" w:before="0"/>
+        <w:ind w:left="504"/>
+      </w:pPr>
+      <w:r>
+        <w:rPr>
+          <w:rFonts w:ascii="Calibri" w:hAnsi="Calibri"/>
+          <w:b w:val="0"/>
+          <w:color w:val="1B2A4A"/>
+          <w:sz w:val="21"/>
+        </w:rPr>
+        <w:t>5.2  Tier 2: Azure Cloud Shell</w:t>
+      </w:r>
+      <w:r>
+        <w:tab/>
+      </w:r>
+    </w:p>
+    <w:p>
+      <w:pPr>
+        <w:tabs>
+          <w:tab w:pos="9072" w:val="right" w:leader="dot"/>
+        </w:tabs>
+        <w:spacing w:after="40" w:before="0"/>
+        <w:ind w:left="504"/>
+      </w:pPr>
+      <w:r>
+        <w:rPr>
+          <w:rFonts w:ascii="Calibri" w:hAnsi="Calibri"/>
+          <w:b w:val="0"/>
+          <w:color w:val="1B2A4A"/>
+          <w:sz w:val="21"/>
+        </w:rPr>
+        <w:t>5.3  Tier 3: Docker (laptop or CI/CD)</w:t>
+      </w:r>
+      <w:r>
+        <w:tab/>
+      </w:r>
+    </w:p>
+    <w:p>
+      <w:pPr>
+        <w:tabs>
+          <w:tab w:pos="9072" w:val="right" w:leader="dot"/>
+        </w:tabs>
+        <w:spacing w:after="40" w:before="0"/>
+      </w:pPr>
+      <w:r>
+        <w:rPr>
+          <w:rFonts w:ascii="Calibri" w:hAnsi="Calibri"/>
+          <w:b/>
+          <w:color w:val="005A9E"/>
+          <w:sz w:val="24"/>
+        </w:rPr>
+        <w:t>6. Supported VM Scenarios</w:t>
+      </w:r>
+      <w:r>
+        <w:tab/>
+      </w:r>
+    </w:p>
+    <w:p>
+      <w:pPr>
+        <w:tabs>
+          <w:tab w:pos="9072" w:val="right" w:leader="dot"/>
+        </w:tabs>
+        <w:spacing w:after="40" w:before="0"/>
+      </w:pPr>
+      <w:r>
+        <w:rPr>
+          <w:rFonts w:ascii="Calibri" w:hAnsi="Calibri"/>
+          <w:b/>
+          <w:color w:val="005A9E"/>
+          <w:sz w:val="24"/>
+        </w:rPr>
+        <w:t>7. Verification Checklist</w:t>
+      </w:r>
+      <w:r>
+        <w:tab/>
+      </w:r>
+    </w:p>
+    <w:p>
+      <w:pPr>
+        <w:tabs>
+          <w:tab w:pos="9072" w:val="right" w:leader="dot"/>
+        </w:tabs>
+        <w:spacing w:after="40" w:before="0"/>
+      </w:pPr>
+      <w:r>
+        <w:rPr>
+          <w:rFonts w:ascii="Calibri" w:hAnsi="Calibri"/>
+          <w:b/>
+          <w:color w:val="005A9E"/>
+          <w:sz w:val="24"/>
+        </w:rPr>
+        <w:t>8. Scaling Guide</w:t>
+      </w:r>
+      <w:r>
+        <w:tab/>
+      </w:r>
+    </w:p>
+    <w:p>
+      <w:pPr>
+        <w:tabs>
+          <w:tab w:pos="9072" w:val="right" w:leader="dot"/>
+        </w:tabs>
+        <w:spacing w:after="40" w:before="0"/>
+      </w:pPr>
+      <w:r>
+        <w:rPr>
+          <w:rFonts w:ascii="Calibri" w:hAnsi="Calibri"/>
+          <w:b/>
+          <w:color w:val="005A9E"/>
+          <w:sz w:val="24"/>
+        </w:rPr>
+        <w:t>9. Troubleshooting Reference</w:t>
+      </w:r>
+      <w:r>
+        <w:tab/>
+      </w:r>
+    </w:p>
+    <w:p>
+      <w:pPr>
+        <w:tabs>
+          <w:tab w:pos="9072" w:val="right" w:leader="dot"/>
+        </w:tabs>
+        <w:spacing w:after="40" w:before="0"/>
+      </w:pPr>
+      <w:r>
+        <w:rPr>
+          <w:rFonts w:ascii="Calibri" w:hAnsi="Calibri"/>
+          <w:b/>
+          <w:color w:val="005A9E"/>
+          <w:sz w:val="24"/>
+        </w:rPr>
+        <w:t>Appendix A: customer_input.yaml Schema</w:t>
+      </w:r>
+      <w:r>
+        <w:tab/>
+      </w:r>
+    </w:p>
+    <w:p>
+      <w:pPr>
+        <w:tabs>
+          <w:tab w:pos="9072" w:val="right" w:leader="dot"/>
+        </w:tabs>
+        <w:spacing w:after="40" w:before="0"/>
+      </w:pPr>
+      <w:r>
+        <w:rPr>
+          <w:rFonts w:ascii="Calibri" w:hAnsi="Calibri"/>
+          <w:b/>
+          <w:color w:val="005A9E"/>
+          <w:sz w:val="24"/>
+        </w:rPr>
+        <w:t>Appendix B: Bulk Tag Script</w:t>
+      </w:r>
+      <w:r>
+        <w:tab/>
+      </w:r>
+    </w:p>
+    <w:p>
+      <w:pPr>
+        <w:tabs>
+          <w:tab w:pos="9072" w:val="right" w:leader="dot"/>
+        </w:tabs>
+        <w:spacing w:after="40" w:before="0"/>
+      </w:pPr>
+      <w:r>
+        <w:rPr>
+          <w:rFonts w:ascii="Calibri" w:hAnsi="Calibri"/>
+          <w:b/>
+          <w:color w:val="005A9E"/>
+          <w:sz w:val="24"/>
+        </w:rPr>
+        <w:t>Appendix C: Quick Links</w:t>
+      </w:r>
+      <w:r>
+        <w:tab/>
       </w:r>
     </w:p>
     <w:p>
@@ -253,7 +542,7 @@
           <w:i w:val="0"/>
           <w:sz w:val="22"/>
         </w:rPr>
-        <w:t>CloudLens Ansible for Azure is a fully automated kit that deploys Keysight CloudLens sensors to every tagged virtual machine in an Azure subscription — Linux and Windows, from a single VM to 5,000+ — without any manual per-host steps.</w:t>
+        <w:t>CloudLens Ansible for Azure is a fully automated kit that deploys Keysight CloudLens sensors to every tagged virtual machine in an Azure subscription. It works on Linux and Windows, from a single VM to 5,000+, without any manual per-host steps.</w:t>
       </w:r>
     </w:p>
     <w:p>
@@ -298,7 +587,7 @@
           <w:color w:val="1B2A4A"/>
           <w:sz w:val="22"/>
         </w:rPr>
-        <w:t>Three entry points — Azure Portal one-click, Cloud Shell curl, or Docker — so customers run it wherever they already work.</w:t>
+        <w:t>Three entry points (Azure Portal one-click, Cloud Shell curl, or Docker), so customers run it wherever they already work.</w:t>
       </w:r>
     </w:p>
     <w:p>
@@ -782,7 +1071,7 @@
           <w:color w:val="556575"/>
           <w:sz w:val="19"/>
         </w:rPr>
-        <w:t>Figure 1 — End-to-end architecture: control point → Azure inventory → OS lanes → CLMS</w:t>
+        <w:t>Figure 1: End-to-end architecture (control point → Azure inventory → OS lanes → CLMS)</w:t>
       </w:r>
     </w:p>
     <w:p>
@@ -804,7 +1093,7 @@
           <w:i w:val="0"/>
           <w:sz w:val="22"/>
         </w:rPr>
-        <w:t>Linux hosts run the CloudLens agent in a Docker container. Windows hosts run the CloudLens Windows sensor as a native service. Every sensor self-registers with CloudLens Manager (CLMS) on first start using the project key supplied in customer_input.yaml — no per-VM UI steps, no static inventory files to maintain.</w:t>
+        <w:t>Linux hosts run the CloudLens agent in a Docker container. Windows hosts run the CloudLens Windows sensor as a native service. Every sensor self-registers with CloudLens Manager (CLMS) on first start using the project key supplied in customer_input.yaml. No per-VM UI steps, no static inventory files to maintain.</w:t>
       </w:r>
     </w:p>
     <w:p>
@@ -828,7 +1117,7 @@
           <w:i w:val="0"/>
           <w:sz w:val="22"/>
         </w:rPr>
-        <w:t>All three paths run the same Ansible engine — same playbooks, same automation. Pick the entry point that matches how your team works.</w:t>
+        <w:t>All three paths run the same Ansible engine. Same playbooks, same automation. Pick the entry point that matches how your team works.</w:t>
       </w:r>
     </w:p>
     <w:p>
@@ -880,7 +1169,7 @@
           <w:color w:val="556575"/>
           <w:sz w:val="19"/>
         </w:rPr>
-        <w:t>Figure 2 — Decision tree: pick the entry point that matches your environment</w:t>
+        <w:t>Figure 2: Decision tree (pick the entry point that matches your environment)</w:t>
       </w:r>
     </w:p>
     <w:tbl>
@@ -1251,7 +1540,7 @@
           <w:i w:val="0"/>
           <w:sz w:val="22"/>
         </w:rPr>
-        <w:t>Confirm every item below before kicking off a deployment. Tick each box as you go — the kit will not magically fix a missing prerequisite.</w:t>
+        <w:t>Confirm every item below before kicking off a deployment. Tick each box as you go. The kit will not magically fix a missing prerequisite.</w:t>
       </w:r>
     </w:p>
     <w:p>
@@ -1295,7 +1584,7 @@
           <w:color w:val="1B2A4A"/>
           <w:sz w:val="22"/>
         </w:rPr>
-        <w:t>Service Principal created (Tier 3 only — see scripts/setup_azure_sp.sh)</w:t>
+        <w:t>Service Principal created (Tier 3 only: see scripts/setup_azure_sp.sh)</w:t>
       </w:r>
     </w:p>
     <w:p>
@@ -1428,7 +1717,7 @@
                 <w:color w:val="1B2A4A"/>
                 <w:sz w:val="21"/>
               </w:rPr>
-              <w:t>Tags are how the dynamic inventory discovers hosts. If a VM is not tagged, the kit cannot see it — and that is the single most common support ticket. Use the bulk-tag script in Appendix B to tag an entire resource group in one shot.</w:t>
+              <w:t>Tags are how the dynamic inventory discovers hosts. If a VM is not tagged, the kit cannot see it. That is the single most common support ticket. Use the bulk-tag script in Appendix B to tag an entire resource group in one shot.</w:t>
             </w:r>
           </w:p>
         </w:tc>
@@ -1445,7 +1734,7 @@
         <w:pStyle w:val="Heading1"/>
       </w:pPr>
       <w:r>
-        <w:t>5. Deployment — Step by Step</w:t>
+        <w:t>5. Deployment, Step by Step</w:t>
       </w:r>
     </w:p>
     <w:p>
@@ -1529,7 +1818,7 @@
           <w:color w:val="1B2A4A"/>
           <w:sz w:val="22"/>
         </w:rPr>
-        <w:t>Watch the runner's boot diagnostics log — every tagged VM is sensored in parallel.</w:t>
+        <w:t>Watch the runner's boot diagnostics log. Every tagged VM is sensored in parallel.</w:t>
       </w:r>
     </w:p>
     <w:p>
@@ -1557,7 +1846,7 @@
           <w:color w:val="556575"/>
           <w:sz w:val="20"/>
         </w:rPr>
-        <w:t>[Screenshot placeholder — Azure Portal Deploy blade]</w:t>
+        <w:t>[Screenshot placeholder: Azure Portal Deploy blade]</w:t>
       </w:r>
     </w:p>
     <w:tbl>
@@ -1737,7 +2026,7 @@
                 <w:color w:val="1B2A4A"/>
                 <w:sz w:val="21"/>
               </w:rPr>
-              <w:t>Wizard discovers tagged VMs, auto-tunes Ansible forks, deploys sensors, and prints a 3/3 success summary. All state lives in your Cloud Shell home directory — nothing installed locally.</w:t>
+              <w:t>Wizard discovers tagged VMs, auto-tunes Ansible forks, deploys sensors, and prints a 3/3 success summary. All state lives in your Cloud Shell home directory, with nothing installed locally.</w:t>
             </w:r>
           </w:p>
         </w:tc>
@@ -1760,7 +2049,7 @@
           <w:i w:val="0"/>
           <w:sz w:val="22"/>
         </w:rPr>
-        <w:t>Best for repeatable runs from a developer laptop, a CI pipeline, or any container host. The image is pinned and hermetic — same result on macOS, Windows, Linux, GitHub Actions, GitLab CI, and Jenkins.</w:t>
+        <w:t>Best for repeatable runs from a developer laptop, a CI pipeline, or any container host. The image is pinned and hermetic, so you get the same result on macOS, Windows, Linux, GitHub Actions, GitLab CI, and Jenkins.</w:t>
       </w:r>
     </w:p>
     <w:p>
@@ -1953,7 +2242,7 @@
           <w:color w:val="556575"/>
           <w:sz w:val="19"/>
         </w:rPr>
-        <w:t>Figure 3 — VM compatibility matrix (OS × topology × auth method)</w:t>
+        <w:t>Figure 3: VM compatibility matrix (OS × topology × auth method)</w:t>
       </w:r>
     </w:p>
     <w:tbl>
@@ -4236,7 +4525,7 @@
         <w:pStyle w:val="Heading1"/>
       </w:pPr>
       <w:r>
-        <w:t>Appendix A — customer_input.yaml Schema</w:t>
+        <w:t>Appendix A: customer_input.yaml Schema</w:t>
       </w:r>
     </w:p>
     <w:p>
@@ -4247,7 +4536,7 @@
           <w:i w:val="0"/>
           <w:sz w:val="22"/>
         </w:rPr>
-        <w:t>Full annotated example. Copy customer_input.yaml.example from the repository to customer_input.yaml and fill in values. Never commit customer_input.yaml to git — credentials belong in env vars.</w:t>
+        <w:t>Full annotated example. Copy customer_input.yaml.example from the repository to customer_input.yaml and fill in values. Never commit customer_input.yaml to git. Credentials belong in env vars.</w:t>
       </w:r>
     </w:p>
     <w:p>
@@ -4271,7 +4560,7 @@
         <w:t xml:space="preserve">  tenant_id:       "00000000-0000-0000-0000-000000000000"</w:t>
         <w:br/>
         <w:br/>
-        <w:t xml:space="preserve">  # Tag selector — VMs are matched by these tags</w:t>
+        <w:t xml:space="preserve">  # Tag selector: VMs are matched by these tags</w:t>
         <w:br/>
         <w:t xml:space="preserve">  tag_filters:</w:t>
         <w:br/>
@@ -4383,7 +4672,7 @@
         <w:pStyle w:val="Heading1"/>
       </w:pPr>
       <w:r>
-        <w:t>Appendix B — Bulk Tag Script</w:t>
+        <w:t>Appendix B: Bulk Tag Script</w:t>
       </w:r>
     </w:p>
     <w:p>
@@ -4506,7 +4795,7 @@
         <w:pStyle w:val="Heading1"/>
       </w:pPr>
       <w:r>
-        <w:t>Appendix C — Quick Links</w:t>
+        <w:t>Appendix C: Quick Links</w:t>
       </w:r>
     </w:p>
     <w:tbl>
@@ -4905,7 +5194,7 @@
           <w:color w:val="556575"/>
           <w:sz w:val="20"/>
         </w:rPr>
-        <w:t>Support email subject (for the Keysight account team): 'CloudLens Ansible Azure — &lt;customer name&gt; — &lt;brief issue&gt;'.</w:t>
+        <w:t>Support email subject (for the Keysight account team): 'CloudLens Ansible Azure: &lt;customer name&gt;, &lt;brief issue&gt;'.</w:t>
       </w:r>
     </w:p>
     <w:sectPr>
@@ -4964,7 +5253,7 @@
         <w:color w:val="005A9E"/>
         <w:sz w:val="18"/>
       </w:rPr>
-      <w:t>CloudLens Ansible — Azure Customer Runbook</w:t>
+      <w:t>CloudLens Ansible for Azure: Customer Runbook</w:t>
     </w:r>
   </w:p>
 </w:hdr>

</xml_diff>